<commit_message>
Rebrand the site to BUL and smooth the landing scroll motion.
Swap Bettim naming and marks for the BUL logo/wordmark, ease scroll-driven effects, and restore the equal three-step cards plus game-selection showcase.

Co-authored-by: Cursor <cursoragent@cursor.com>
</commit_message>
<xml_diff>
--- a/public/docs/privacy-policy.docx
+++ b/public/docs/privacy-policy.docx
@@ -23,7 +23,7 @@
           <w:szCs w:val="30"/>
           <w:rtl w:val="0"/>
         </w:rPr>
-        <w:t xml:space="preserve">🟣 Bettim Privacy Policy</w:t>
+        <w:t xml:space="preserve">🟣 BUL Privacy Policy</w:t>
       </w:r>
     </w:p>
     <w:p>
@@ -170,7 +170,7 @@
           <w:szCs w:val="24"/>
           <w:rtl w:val="0"/>
         </w:rPr>
-        <w:t xml:space="preserve">This Privacy Policy explains how Bettim Ltd. ("Bettim", "we", "us", or "our") collects, uses, shares, and safeguards your personal information when you access or use the Bettim mobile application, website, and any related features or services (collectively, the "Services").</w:t>
+        <w:t xml:space="preserve">This Privacy Policy explains how Bettim Ltd. ("BUL", "we", "us", or "our") collects, uses, shares, and safeguards your personal information when you access or use the BUL mobile application, website, and any related features or services (collectively, the "Services").</w:t>
       </w:r>
     </w:p>
     <w:p>
@@ -225,27 +225,27 @@
           <w:szCs w:val="24"/>
           <w:rtl w:val="0"/>
         </w:rPr>
-        <w:t xml:space="preserve">Bettim is an independent platform and is not affiliated with, sponsored by, or endorsed by the National Basketball Association (NBA), the NCAA, or any of their respective teams or organizations. Any references within the Services to leagues, teams, players, venues, trademarks, or events are for informational and descriptive purposes only and do not imply any partnership, endorsement, or official status.</w:t>
-      </w:r>
-    </w:p>
-    <w:p>
-      <w:pPr>
-        <w:shd w:fill="ffffff" w:val="clear"/>
-        <w:spacing w:after="240" w:before="240" w:lineRule="auto"/>
-        <w:rPr>
-          <w:color w:val="0f1115"/>
-          <w:sz w:val="24"/>
-          <w:szCs w:val="24"/>
-        </w:rPr>
-      </w:pPr>
-      <w:r>
-        <w:rPr>
-          <w:color w:val="0f1115"/>
-          <w:sz w:val="24"/>
-          <w:szCs w:val="24"/>
-          <w:rtl w:val="0"/>
-        </w:rPr>
-        <w:t xml:space="preserve">By using Bettim, you agree to this Policy and to our Terms of Service. If you do not agree, please discontinue use of the Services.</w:t>
+        <w:t xml:space="preserve">BUL is an independent platform and is not affiliated with, sponsored by, or endorsed by the National Basketball Association (NBA), the NCAA, or any of their respective teams or organizations. Any references within the Services to leagues, teams, players, venues, trademarks, or events are for informational and descriptive purposes only and do not imply any partnership, endorsement, or official status.</w:t>
+      </w:r>
+    </w:p>
+    <w:p>
+      <w:pPr>
+        <w:shd w:fill="ffffff" w:val="clear"/>
+        <w:spacing w:after="240" w:before="240" w:lineRule="auto"/>
+        <w:rPr>
+          <w:color w:val="0f1115"/>
+          <w:sz w:val="24"/>
+          <w:szCs w:val="24"/>
+        </w:rPr>
+      </w:pPr>
+      <w:r>
+        <w:rPr>
+          <w:color w:val="0f1115"/>
+          <w:sz w:val="24"/>
+          <w:szCs w:val="24"/>
+          <w:rtl w:val="0"/>
+        </w:rPr>
+        <w:t xml:space="preserve">By using BUL, you agree to this Policy and to our Terms of Service. If you do not agree, please discontinue use of the Services.</w:t>
       </w:r>
     </w:p>
     <w:p>
@@ -289,7 +289,7 @@
           <w:szCs w:val="24"/>
           <w:rtl w:val="0"/>
         </w:rPr>
-        <w:t xml:space="preserve">Bettim provides an entertaining, social, skill-based sports experience powered by virtual coins only — no real-money gambling, deposits, or withdrawals.</w:t>
+        <w:t xml:space="preserve">BUL provides an entertaining, social, skill-based sports experience powered by virtual coins only — no real-money gambling, deposits, or withdrawals.</w:t>
       </w:r>
     </w:p>
     <w:p>
@@ -478,7 +478,7 @@
           <w:szCs w:val="24"/>
           <w:rtl w:val="0"/>
         </w:rPr>
-        <w:t xml:space="preserve">In rare cases, Bettim may request verification to confirm eligibility, prevent fraud, or comply with laws. You may redact irrelevant details (e.g., ID number). Verification data is stored only as long as needed to complete the review, then permanently deleted.</w:t>
+        <w:t xml:space="preserve">In rare cases, BUL may request verification to confirm eligibility, prevent fraud, or comply with laws. You may redact irrelevant details (e.g., ID number). Verification data is stored only as long as needed to complete the review, then permanently deleted.</w:t>
       </w:r>
     </w:p>
     <w:p>
@@ -522,7 +522,7 @@
           <w:szCs w:val="24"/>
           <w:rtl w:val="0"/>
         </w:rPr>
-        <w:t xml:space="preserve">When you use Bettim, we automatically collect:</w:t>
+        <w:t xml:space="preserve">When you use BUL, we automatically collect:</w:t>
       </w:r>
     </w:p>
     <w:p>
@@ -1863,7 +1863,7 @@
           <w:szCs w:val="24"/>
           <w:rtl w:val="0"/>
         </w:rPr>
-        <w:t xml:space="preserve">In addition, Bettim does not make decisions based solely on automated processing that produce legal or similarly significant effects on users. Any automated checks (e.g., where available VPN/proxy indicators or device integrity signals) are limited to protecting the Services, maintaining fairness, and enforcing our Terms of Service.</w:t>
+        <w:t xml:space="preserve">In addition, BUL does not make decisions based solely on automated processing that produce legal or similarly significant effects on users. Any automated checks (e.g., where available VPN/proxy indicators or device integrity signals) are limited to protecting the Services, maintaining fairness, and enforcing our Terms of Service.</w:t>
       </w:r>
     </w:p>
     <w:p>
@@ -1944,7 +1944,7 @@
           <w:szCs w:val="24"/>
           <w:rtl w:val="0"/>
         </w:rPr>
-        <w:t xml:space="preserve">Depending on your jurisdiction, Bettim processes your data under:</w:t>
+        <w:t xml:space="preserve">Depending on your jurisdiction, BUL processes your data under:</w:t>
       </w:r>
     </w:p>
     <w:p>
@@ -2154,9 +2154,9 @@
         </w:rPr>
         <w:t xml:space="preserve">Global Privacy Compliance</w:t>
         <w:br w:type="textWrapping"/>
-        <w:t xml:space="preserve">Bettim processes personal data in accordance with applicable privacy and data protection laws in the regions where our users are located, including (where relevant) the EU GDPR, UK GDPR, the California Consumer Privacy Act (CCPA/CPRA), Brazil's General Data Protection Law (LGPD), and Canada's Personal Information Protection and Electronic Documents Act (PIPEDA).</w:t>
-        <w:br w:type="textWrapping"/>
-        <w:t xml:space="preserve">Nothing in this Policy shall be interpreted as Bettim submitting to the jurisdiction of any foreign authority or waiving its exclusive jurisdiction in Israel as defined in our Terms of Service.</w:t>
+        <w:t xml:space="preserve">BUL processes personal data in accordance with applicable privacy and data protection laws in the regions where our users are located, including (where relevant) the EU GDPR, UK GDPR, the California Consumer Privacy Act (CCPA/CPRA), Brazil's General Data Protection Law (LGPD), and Canada's Personal Information Protection and Electronic Documents Act (PIPEDA).</w:t>
+        <w:br w:type="textWrapping"/>
+        <w:t xml:space="preserve">Nothing in this Policy shall be interpreted as BUL submitting to the jurisdiction of any foreign authority or waiving its exclusive jurisdiction in Israel as defined in our Terms of Service.</w:t>
       </w:r>
     </w:p>
     <w:p>
@@ -2225,7 +2225,7 @@
           <w:szCs w:val="24"/>
           <w:rtl w:val="0"/>
         </w:rPr>
-        <w:t xml:space="preserve">We may share personal information only as described below and only to the extent necessary to operate the Services, comply with law, and protect Bettim and users.</w:t>
+        <w:t xml:space="preserve">We may share personal information only as described below and only to the extent necessary to operate the Services, comply with law, and protect BUL and users.</w:t>
       </w:r>
     </w:p>
     <w:p>
@@ -2289,7 +2289,7 @@
           <w:szCs w:val="24"/>
           <w:rtl w:val="0"/>
         </w:rPr>
-        <w:t xml:space="preserve"> We may share information with our affiliates, subsidiaries, and related entities for internal business purposes consistent with this Policy, including operating, improving, securing, and supporting the Services. References to “Bettim” include such entities where applicable.</w:t>
+        <w:t xml:space="preserve"> We may share information with our affiliates, subsidiaries, and related entities for internal business purposes consistent with this Policy, including operating, improving, securing, and supporting the Services. References to “BUL” include such entities where applicable.</w:t>
       </w:r>
     </w:p>
     <w:p>
@@ -2396,7 +2396,7 @@
           <w:szCs w:val="24"/>
           <w:rtl w:val="0"/>
         </w:rPr>
-        <w:t xml:space="preserve">Protect the rights, property, and safety of Bettim, our users, or others;</w:t>
+        <w:t xml:space="preserve">Protect the rights, property, and safety of BUL, our users, or others;</w:t>
       </w:r>
     </w:p>
     <w:p>
@@ -2478,7 +2478,7 @@
           <w:szCs w:val="24"/>
           <w:rtl w:val="0"/>
         </w:rPr>
-        <w:t xml:space="preserve"> If Bettim is involved in a merger, acquisition, financing, restructuring, bankruptcy, or sale of all or part of its business or assets, personal information may be disclosed or transferred as part of that transaction. We will require the recipient to handle personal information in a manner consistent with this Policy (or provide notice and choices where required by law).</w:t>
+        <w:t xml:space="preserve"> If BUL is involved in a merger, acquisition, financing, restructuring, bankruptcy, or sale of all or part of its business or assets, personal information may be disclosed or transferred as part of that transaction. We will require the recipient to handle personal information in a manner consistent with this Policy (or provide notice and choices where required by law).</w:t>
       </w:r>
     </w:p>
     <w:p>
@@ -2553,7 +2553,7 @@
           <w:szCs w:val="24"/>
           <w:rtl w:val="0"/>
         </w:rPr>
-        <w:t xml:space="preserve">User Content is created and provided by users, not by Bettim. Bettim does not control, endorse, or guarantee the accuracy, integrity, or appropriateness of any User Content, and is not responsible for User Content posted by users.</w:t>
+        <w:t xml:space="preserve">User Content is created and provided by users, not by BUL. BUL does not control, endorse, or guarantee the accuracy, integrity, or appropriateness of any User Content, and is not responsible for User Content posted by users.</w:t>
         <w:br w:type="textWrapping"/>
       </w:r>
       <w:r>
@@ -2574,16 +2574,16 @@
           <w:szCs w:val="24"/>
           <w:rtl w:val="0"/>
         </w:rPr>
-        <w:t xml:space="preserve">Bettim has no obligation to monitor, pre-screen, or filter User Content and does not guarantee that any moderation will be timely, complete, or error-free.</w:t>
-      </w:r>
-      <w:r>
-        <w:rPr>
-          <w:color w:val="0f1115"/>
-          <w:sz w:val="24"/>
-          <w:szCs w:val="24"/>
-          <w:rtl w:val="0"/>
-        </w:rPr>
-        <w:t xml:space="preserve"> Bettim </w:t>
+        <w:t xml:space="preserve">BUL has no obligation to monitor, pre-screen, or filter User Content and does not guarantee that any moderation will be timely, complete, or error-free.</w:t>
+      </w:r>
+      <w:r>
+        <w:rPr>
+          <w:color w:val="0f1115"/>
+          <w:sz w:val="24"/>
+          <w:szCs w:val="24"/>
+          <w:rtl w:val="0"/>
+        </w:rPr>
+        <w:t xml:space="preserve"> BUL </w:t>
       </w:r>
       <w:r>
         <w:rPr>
@@ -2635,7 +2635,7 @@
           <w:szCs w:val="24"/>
           <w:rtl w:val="0"/>
         </w:rPr>
-        <w:t xml:space="preserve"> Where applicable, if you install or access the Services through Apple or Google, those platform providers may collect certain information in accordance with their own terms and policies. If Bettim introduces paid features in the future, any purchase processing handled through app stores will be governed by the applicable app store billing and refund policies.</w:t>
+        <w:t xml:space="preserve"> Where applicable, if you install or access the Services through Apple or Google, those platform providers may collect certain information in accordance with their own terms and policies. If BUL introduces paid features in the future, any purchase processing handled through app stores will be governed by the applicable app store billing and refund policies.</w:t>
       </w:r>
     </w:p>
     <w:p>
@@ -2803,66 +2803,66 @@
           <w:szCs w:val="24"/>
           <w:rtl w:val="0"/>
         </w:rPr>
-        <w:t xml:space="preserve"> Bettim relies on the 2021 Standard Contractual Clauses (SCCs) approved by the EU Commission, plus technical safeguards such as encryption and minimization. </w:t>
-      </w:r>
-      <w:r>
-        <w:rPr>
-          <w:b w:val="1"/>
-          <w:bCs w:val="1"/>
-          <w:color w:val="0f1115"/>
-          <w:sz w:val="24"/>
-          <w:szCs w:val="24"/>
-          <w:rtl w:val="0"/>
-        </w:rPr>
-        <w:t xml:space="preserve">For transfers of personal data from the United Kingdom, Bettim uses the UK ICO International Data Transfer Agreement (IDTA) or the UK Addendum to the EU Standard Contractual Clauses (SCCs), as applicable under the UK Data Protection Act 2018 and the UK GDPR.</w:t>
-      </w:r>
-    </w:p>
-    <w:p>
-      <w:pPr>
-        <w:shd w:fill="ffffff" w:val="clear"/>
-        <w:spacing w:after="240" w:before="240" w:lineRule="auto"/>
-        <w:rPr>
-          <w:b w:val="1"/>
-          <w:bCs w:val="1"/>
-          <w:color w:val="0f1115"/>
-          <w:sz w:val="24"/>
-          <w:szCs w:val="24"/>
-        </w:rPr>
-      </w:pPr>
-      <w:r>
-        <w:rPr>
-          <w:b w:val="1"/>
-          <w:bCs w:val="1"/>
-          <w:color w:val="0f1115"/>
-          <w:sz w:val="24"/>
-          <w:szCs w:val="24"/>
-          <w:rtl w:val="0"/>
-        </w:rPr>
-        <w:t xml:space="preserve">Bettim also conducts Transfer Impact Assessments (TIAs) and applies supplementary measures — including encryption, minimization, and strict access controls — where required by law to ensure equivalent protection for personal data transferred to non-adequate jurisdictions.</w:t>
-      </w:r>
-    </w:p>
-    <w:p>
-      <w:pPr>
-        <w:shd w:fill="ffffff" w:val="clear"/>
-        <w:spacing w:after="240" w:before="240" w:lineRule="auto"/>
-        <w:rPr>
-          <w:b w:val="1"/>
-          <w:bCs w:val="1"/>
-          <w:color w:val="0f1115"/>
-          <w:sz w:val="24"/>
-          <w:szCs w:val="24"/>
-        </w:rPr>
-      </w:pPr>
-      <w:r>
-        <w:rPr>
-          <w:b w:val="1"/>
-          <w:bCs w:val="1"/>
-          <w:color w:val="0f1115"/>
-          <w:sz w:val="24"/>
-          <w:szCs w:val="24"/>
-          <w:rtl w:val="0"/>
-        </w:rPr>
-        <w:t xml:space="preserve">Bettim does not transfer personal data to any country lacking adequate data protection unless such transfer is strictly necessary, subject to appropriate safeguards, and compliant with applicable law.</w:t>
+        <w:t xml:space="preserve"> BUL relies on the 2021 Standard Contractual Clauses (SCCs) approved by the EU Commission, plus technical safeguards such as encryption and minimization. </w:t>
+      </w:r>
+      <w:r>
+        <w:rPr>
+          <w:b w:val="1"/>
+          <w:bCs w:val="1"/>
+          <w:color w:val="0f1115"/>
+          <w:sz w:val="24"/>
+          <w:szCs w:val="24"/>
+          <w:rtl w:val="0"/>
+        </w:rPr>
+        <w:t xml:space="preserve">For transfers of personal data from the United Kingdom, BUL uses the UK ICO International Data Transfer Agreement (IDTA) or the UK Addendum to the EU Standard Contractual Clauses (SCCs), as applicable under the UK Data Protection Act 2018 and the UK GDPR.</w:t>
+      </w:r>
+    </w:p>
+    <w:p>
+      <w:pPr>
+        <w:shd w:fill="ffffff" w:val="clear"/>
+        <w:spacing w:after="240" w:before="240" w:lineRule="auto"/>
+        <w:rPr>
+          <w:b w:val="1"/>
+          <w:bCs w:val="1"/>
+          <w:color w:val="0f1115"/>
+          <w:sz w:val="24"/>
+          <w:szCs w:val="24"/>
+        </w:rPr>
+      </w:pPr>
+      <w:r>
+        <w:rPr>
+          <w:b w:val="1"/>
+          <w:bCs w:val="1"/>
+          <w:color w:val="0f1115"/>
+          <w:sz w:val="24"/>
+          <w:szCs w:val="24"/>
+          <w:rtl w:val="0"/>
+        </w:rPr>
+        <w:t xml:space="preserve">BUL also conducts Transfer Impact Assessments (TIAs) and applies supplementary measures — including encryption, minimization, and strict access controls — where required by law to ensure equivalent protection for personal data transferred to non-adequate jurisdictions.</w:t>
+      </w:r>
+    </w:p>
+    <w:p>
+      <w:pPr>
+        <w:shd w:fill="ffffff" w:val="clear"/>
+        <w:spacing w:after="240" w:before="240" w:lineRule="auto"/>
+        <w:rPr>
+          <w:b w:val="1"/>
+          <w:bCs w:val="1"/>
+          <w:color w:val="0f1115"/>
+          <w:sz w:val="24"/>
+          <w:szCs w:val="24"/>
+        </w:rPr>
+      </w:pPr>
+      <w:r>
+        <w:rPr>
+          <w:b w:val="1"/>
+          <w:bCs w:val="1"/>
+          <w:color w:val="0f1115"/>
+          <w:sz w:val="24"/>
+          <w:szCs w:val="24"/>
+          <w:rtl w:val="0"/>
+        </w:rPr>
+        <w:t xml:space="preserve">BUL does not transfer personal data to any country lacking adequate data protection unless such transfer is strictly necessary, subject to appropriate safeguards, and compliant with applicable law.</w:t>
       </w:r>
     </w:p>
     <w:p>
@@ -3147,7 +3147,7 @@
           <w:szCs w:val="24"/>
           <w:rtl w:val="0"/>
         </w:rPr>
-        <w:t xml:space="preserve">While Bettim maintains safeguards, no electronic system is 100% secure. If a breach posing significant risk occurs, we will notify affected users and relevant authorities promptly, in accordance with law.</w:t>
+        <w:t xml:space="preserve">While BUL maintains safeguards, no electronic system is 100% secure. If a breach posing significant risk occurs, we will notify affected users and relevant authorities promptly, in accordance with law.</w:t>
       </w:r>
     </w:p>
     <w:p>
@@ -3260,7 +3260,7 @@
           <w:szCs w:val="24"/>
           <w:rtl w:val="0"/>
         </w:rPr>
-        <w:t xml:space="preserve">Bettim does not use cookies for advertising or behavioral profiling. We only use </w:t>
+        <w:t xml:space="preserve">BUL does not use cookies for advertising or behavioral profiling. We only use </w:t>
       </w:r>
       <w:r>
         <w:rPr>
@@ -3344,7 +3344,7 @@
           <w:szCs w:val="24"/>
           <w:rtl w:val="0"/>
         </w:rPr>
-        <w:t xml:space="preserve">Bettim does not engage in targeted advertising or cross-context behavioral tracking. We also honor applicable opt-out preference signals, such as the Global Privacy Control (GPC), where required by law.</w:t>
+        <w:t xml:space="preserve">BUL does not engage in targeted advertising or cross-context behavioral tracking. We also honor applicable opt-out preference signals, such as the Global Privacy Control (GPC), where required by law.</w:t>
       </w:r>
     </w:p>
     <w:p>
@@ -3508,7 +3508,7 @@
           <w:szCs w:val="24"/>
           <w:rtl w:val="0"/>
         </w:rPr>
-        <w:t xml:space="preserve">You can exercise these rights by contacting support@bettim.co. We may verify your identity before processing requests and will respond without undue delay and, where applicable, within 30 days (GDPR/UK GDPR) or 45 days (CCPA/CPRA). This period may be extended once by an additional 45 days where reasonably necessary. We will not discriminate against any user for exercising privacy rights. Bettim also honors substantially similar privacy rights granted under other U.S. state privacy laws (including Virginia, Colorado, Connecticut, and Utah).</w:t>
+        <w:t xml:space="preserve">You can exercise these rights by contacting support@bettim.co. We may verify your identity before processing requests and will respond without undue delay and, where applicable, within 30 days (GDPR/UK GDPR) or 45 days (CCPA/CPRA). This period may be extended once by an additional 45 days where reasonably necessary. We will not discriminate against any user for exercising privacy rights. BUL also honors substantially similar privacy rights granted under other U.S. state privacy laws (including Virginia, Colorado, Connecticut, and Utah).</w:t>
       </w:r>
     </w:p>
     <w:p>
@@ -3688,7 +3688,7 @@
           <w:szCs w:val="24"/>
           <w:rtl w:val="0"/>
         </w:rPr>
-        <w:t xml:space="preserve">Please note that Bettim does not sell or share personal information as these terms are defined under the CCPA/CPRA.</w:t>
+        <w:t xml:space="preserve">Please note that BUL does not sell or share personal information as these terms are defined under the CCPA/CPRA.</w:t>
       </w:r>
     </w:p>
     <w:p>
@@ -3847,7 +3847,7 @@
           <w:szCs w:val="24"/>
           <w:rtl w:val="0"/>
         </w:rPr>
-        <w:t xml:space="preserve">You can unsubscribe from marketing emails via opt-out links or app settings. However, Bettim will continue to send essential service notifications (e.g., security alerts, account recovery).</w:t>
+        <w:t xml:space="preserve">You can unsubscribe from marketing emails via opt-out links or app settings. However, BUL will continue to send essential service notifications (e.g., security alerts, account recovery).</w:t>
       </w:r>
     </w:p>
     <w:p>
@@ -3978,7 +3978,7 @@
           <w:szCs w:val="24"/>
           <w:rtl w:val="0"/>
         </w:rPr>
-        <w:t xml:space="preserve"> You are solely responsible for your User Content and for any consequences of posting or sharing it. Bettim does not endorse, verify, or guarantee User Content and is not responsible for User Content posted by users, including statements, advice, links, or files shared by users.</w:t>
+        <w:t xml:space="preserve"> You are solely responsible for your User Content and for any consequences of posting or sharing it. BUL does not endorse, verify, or guarantee User Content and is not responsible for User Content posted by users, including statements, advice, links, or files shared by users.</w:t>
       </w:r>
     </w:p>
     <w:p>
@@ -4009,7 +4009,7 @@
           <w:szCs w:val="24"/>
           <w:rtl w:val="0"/>
         </w:rPr>
-        <w:t xml:space="preserve"> Bettim has no obligation to monitor, screen, or filter User Content, and we do not guarantee that any moderation will detect or prevent all prohibited or harmful content. Bettim may (but is not required to) remove or restrict User Content or access to community features to enforce our Terms of Service, comply with law, or protect users and platform integrity.</w:t>
+        <w:t xml:space="preserve"> BUL has no obligation to monitor, screen, or filter User Content, and we do not guarantee that any moderation will detect or prevent all prohibited or harmful content. BUL may (but is not required to) remove or restrict User Content or access to community features to enforce our Terms of Service, comply with law, or protect users and platform integrity.</w:t>
         <w:br w:type="textWrapping"/>
         <w:t xml:space="preserve">Users may report suspected violations through the in-app reporting tools (where available) or by contacting support@bettim.co.</w:t>
       </w:r>
@@ -4032,7 +4032,7 @@
           <w:szCs w:val="24"/>
           <w:rtl w:val="0"/>
         </w:rPr>
-        <w:t xml:space="preserve">Bettim is not responsible for user interactions, disputes, or any harm, loss, or damage resulting from communications or interactions between users, whether online or offline.</w:t>
+        <w:t xml:space="preserve">BUL is not responsible for user interactions, disputes, or any harm, loss, or damage resulting from communications or interactions between users, whether online or offline.</w:t>
       </w:r>
     </w:p>
     <w:p>
@@ -4465,7 +4465,7 @@
           <w:szCs w:val="24"/>
           <w:rtl w:val="0"/>
         </w:rPr>
-        <w:t xml:space="preserve">Bettim has appointed a privacy and compliance contact responsible for overseeing data protection matters.</w:t>
+        <w:t xml:space="preserve">BUL has appointed a privacy and compliance contact responsible for overseeing data protection matters.</w:t>
         <w:br w:type="textWrapping"/>
         <w:t xml:space="preserve">You may contact this representative at support@bettim.co for any inquiries related to GDPR, UK GDPR, CCPA, or other data protection frameworks.</w:t>
       </w:r>
@@ -4491,7 +4491,7 @@
           <w:szCs w:val="24"/>
           <w:rtl w:val="0"/>
         </w:rPr>
-        <w:t xml:space="preserve">Bettim does not maintain a separate privacy inbox; all privacy-related requests are processed via support@bettim.co under strict internal routing protocols.</w:t>
+        <w:t xml:space="preserve">BUL does not maintain a separate privacy inbox; all privacy-related requests are processed via support@bettim.co under strict internal routing protocols.</w:t>
       </w:r>
     </w:p>
     <w:p>
@@ -4517,7 +4517,7 @@
         </w:rPr>
         <w:t xml:space="preserve">EU/UK Representatives (Art. 27)</w:t>
         <w:br w:type="textWrapping"/>
-        <w:t xml:space="preserve">If Bettim is later required to appoint data protection representatives in the European Union or the United Kingdom, their contact details will be published here. Until such appointment, users in those regions may contact us directly at support@bettim.co.</w:t>
+        <w:t xml:space="preserve">If BUL is later required to appoint data protection representatives in the European Union or the United Kingdom, their contact details will be published here. Until such appointment, users in those regions may contact us directly at support@bettim.co.</w:t>
       </w:r>
     </w:p>
     <w:p>
@@ -4624,7 +4624,7 @@
           <w:szCs w:val="24"/>
           <w:rtl w:val="0"/>
         </w:rPr>
-        <w:t xml:space="preserve">This document represents the complete and authoritative version of the Bettim Privacy Policy.</w:t>
+        <w:t xml:space="preserve">This document represents the complete and authoritative version of the BUL Privacy Policy.</w:t>
       </w:r>
     </w:p>
     <w:p>

</xml_diff>

<commit_message>
Revert "Merge pull request #6 from alanskverer/scrollcraft/extreme"
This reverts commit 54f71ec7974e69990c24814745e775c190bdda50, reversing
changes made to 1277e88d51a0d2afa8c9bce94230489d5ef60f79.
</commit_message>
<xml_diff>
--- a/public/docs/privacy-policy.docx
+++ b/public/docs/privacy-policy.docx
@@ -23,7 +23,7 @@
           <w:szCs w:val="30"/>
           <w:rtl w:val="0"/>
         </w:rPr>
-        <w:t xml:space="preserve">🟣 BUL Privacy Policy</w:t>
+        <w:t xml:space="preserve">🟣 Bettim Privacy Policy</w:t>
       </w:r>
     </w:p>
     <w:p>
@@ -170,7 +170,7 @@
           <w:szCs w:val="24"/>
           <w:rtl w:val="0"/>
         </w:rPr>
-        <w:t xml:space="preserve">This Privacy Policy explains how Bettim Ltd. ("BUL", "we", "us", or "our") collects, uses, shares, and safeguards your personal information when you access or use the BUL mobile application, website, and any related features or services (collectively, the "Services").</w:t>
+        <w:t xml:space="preserve">This Privacy Policy explains how Bettim Ltd. ("Bettim", "we", "us", or "our") collects, uses, shares, and safeguards your personal information when you access or use the Bettim mobile application, website, and any related features or services (collectively, the "Services").</w:t>
       </w:r>
     </w:p>
     <w:p>
@@ -225,27 +225,27 @@
           <w:szCs w:val="24"/>
           <w:rtl w:val="0"/>
         </w:rPr>
-        <w:t xml:space="preserve">BUL is an independent platform and is not affiliated with, sponsored by, or endorsed by the National Basketball Association (NBA), the NCAA, or any of their respective teams or organizations. Any references within the Services to leagues, teams, players, venues, trademarks, or events are for informational and descriptive purposes only and do not imply any partnership, endorsement, or official status.</w:t>
-      </w:r>
-    </w:p>
-    <w:p>
-      <w:pPr>
-        <w:shd w:fill="ffffff" w:val="clear"/>
-        <w:spacing w:after="240" w:before="240" w:lineRule="auto"/>
-        <w:rPr>
-          <w:color w:val="0f1115"/>
-          <w:sz w:val="24"/>
-          <w:szCs w:val="24"/>
-        </w:rPr>
-      </w:pPr>
-      <w:r>
-        <w:rPr>
-          <w:color w:val="0f1115"/>
-          <w:sz w:val="24"/>
-          <w:szCs w:val="24"/>
-          <w:rtl w:val="0"/>
-        </w:rPr>
-        <w:t xml:space="preserve">By using BUL, you agree to this Policy and to our Terms of Service. If you do not agree, please discontinue use of the Services.</w:t>
+        <w:t xml:space="preserve">Bettim is an independent platform and is not affiliated with, sponsored by, or endorsed by the National Basketball Association (NBA), the NCAA, or any of their respective teams or organizations. Any references within the Services to leagues, teams, players, venues, trademarks, or events are for informational and descriptive purposes only and do not imply any partnership, endorsement, or official status.</w:t>
+      </w:r>
+    </w:p>
+    <w:p>
+      <w:pPr>
+        <w:shd w:fill="ffffff" w:val="clear"/>
+        <w:spacing w:after="240" w:before="240" w:lineRule="auto"/>
+        <w:rPr>
+          <w:color w:val="0f1115"/>
+          <w:sz w:val="24"/>
+          <w:szCs w:val="24"/>
+        </w:rPr>
+      </w:pPr>
+      <w:r>
+        <w:rPr>
+          <w:color w:val="0f1115"/>
+          <w:sz w:val="24"/>
+          <w:szCs w:val="24"/>
+          <w:rtl w:val="0"/>
+        </w:rPr>
+        <w:t xml:space="preserve">By using Bettim, you agree to this Policy and to our Terms of Service. If you do not agree, please discontinue use of the Services.</w:t>
       </w:r>
     </w:p>
     <w:p>
@@ -289,7 +289,7 @@
           <w:szCs w:val="24"/>
           <w:rtl w:val="0"/>
         </w:rPr>
-        <w:t xml:space="preserve">BUL provides an entertaining, social, skill-based sports experience powered by virtual coins only — no real-money gambling, deposits, or withdrawals.</w:t>
+        <w:t xml:space="preserve">Bettim provides an entertaining, social, skill-based sports experience powered by virtual coins only — no real-money gambling, deposits, or withdrawals.</w:t>
       </w:r>
     </w:p>
     <w:p>
@@ -478,7 +478,7 @@
           <w:szCs w:val="24"/>
           <w:rtl w:val="0"/>
         </w:rPr>
-        <w:t xml:space="preserve">In rare cases, BUL may request verification to confirm eligibility, prevent fraud, or comply with laws. You may redact irrelevant details (e.g., ID number). Verification data is stored only as long as needed to complete the review, then permanently deleted.</w:t>
+        <w:t xml:space="preserve">In rare cases, Bettim may request verification to confirm eligibility, prevent fraud, or comply with laws. You may redact irrelevant details (e.g., ID number). Verification data is stored only as long as needed to complete the review, then permanently deleted.</w:t>
       </w:r>
     </w:p>
     <w:p>
@@ -522,7 +522,7 @@
           <w:szCs w:val="24"/>
           <w:rtl w:val="0"/>
         </w:rPr>
-        <w:t xml:space="preserve">When you use BUL, we automatically collect:</w:t>
+        <w:t xml:space="preserve">When you use Bettim, we automatically collect:</w:t>
       </w:r>
     </w:p>
     <w:p>
@@ -1863,7 +1863,7 @@
           <w:szCs w:val="24"/>
           <w:rtl w:val="0"/>
         </w:rPr>
-        <w:t xml:space="preserve">In addition, BUL does not make decisions based solely on automated processing that produce legal or similarly significant effects on users. Any automated checks (e.g., where available VPN/proxy indicators or device integrity signals) are limited to protecting the Services, maintaining fairness, and enforcing our Terms of Service.</w:t>
+        <w:t xml:space="preserve">In addition, Bettim does not make decisions based solely on automated processing that produce legal or similarly significant effects on users. Any automated checks (e.g., where available VPN/proxy indicators or device integrity signals) are limited to protecting the Services, maintaining fairness, and enforcing our Terms of Service.</w:t>
       </w:r>
     </w:p>
     <w:p>
@@ -1944,7 +1944,7 @@
           <w:szCs w:val="24"/>
           <w:rtl w:val="0"/>
         </w:rPr>
-        <w:t xml:space="preserve">Depending on your jurisdiction, BUL processes your data under:</w:t>
+        <w:t xml:space="preserve">Depending on your jurisdiction, Bettim processes your data under:</w:t>
       </w:r>
     </w:p>
     <w:p>
@@ -2154,9 +2154,9 @@
         </w:rPr>
         <w:t xml:space="preserve">Global Privacy Compliance</w:t>
         <w:br w:type="textWrapping"/>
-        <w:t xml:space="preserve">BUL processes personal data in accordance with applicable privacy and data protection laws in the regions where our users are located, including (where relevant) the EU GDPR, UK GDPR, the California Consumer Privacy Act (CCPA/CPRA), Brazil's General Data Protection Law (LGPD), and Canada's Personal Information Protection and Electronic Documents Act (PIPEDA).</w:t>
-        <w:br w:type="textWrapping"/>
-        <w:t xml:space="preserve">Nothing in this Policy shall be interpreted as BUL submitting to the jurisdiction of any foreign authority or waiving its exclusive jurisdiction in Israel as defined in our Terms of Service.</w:t>
+        <w:t xml:space="preserve">Bettim processes personal data in accordance with applicable privacy and data protection laws in the regions where our users are located, including (where relevant) the EU GDPR, UK GDPR, the California Consumer Privacy Act (CCPA/CPRA), Brazil's General Data Protection Law (LGPD), and Canada's Personal Information Protection and Electronic Documents Act (PIPEDA).</w:t>
+        <w:br w:type="textWrapping"/>
+        <w:t xml:space="preserve">Nothing in this Policy shall be interpreted as Bettim submitting to the jurisdiction of any foreign authority or waiving its exclusive jurisdiction in Israel as defined in our Terms of Service.</w:t>
       </w:r>
     </w:p>
     <w:p>
@@ -2225,7 +2225,7 @@
           <w:szCs w:val="24"/>
           <w:rtl w:val="0"/>
         </w:rPr>
-        <w:t xml:space="preserve">We may share personal information only as described below and only to the extent necessary to operate the Services, comply with law, and protect BUL and users.</w:t>
+        <w:t xml:space="preserve">We may share personal information only as described below and only to the extent necessary to operate the Services, comply with law, and protect Bettim and users.</w:t>
       </w:r>
     </w:p>
     <w:p>
@@ -2289,7 +2289,7 @@
           <w:szCs w:val="24"/>
           <w:rtl w:val="0"/>
         </w:rPr>
-        <w:t xml:space="preserve"> We may share information with our affiliates, subsidiaries, and related entities for internal business purposes consistent with this Policy, including operating, improving, securing, and supporting the Services. References to “BUL” include such entities where applicable.</w:t>
+        <w:t xml:space="preserve"> We may share information with our affiliates, subsidiaries, and related entities for internal business purposes consistent with this Policy, including operating, improving, securing, and supporting the Services. References to “Bettim” include such entities where applicable.</w:t>
       </w:r>
     </w:p>
     <w:p>
@@ -2396,7 +2396,7 @@
           <w:szCs w:val="24"/>
           <w:rtl w:val="0"/>
         </w:rPr>
-        <w:t xml:space="preserve">Protect the rights, property, and safety of BUL, our users, or others;</w:t>
+        <w:t xml:space="preserve">Protect the rights, property, and safety of Bettim, our users, or others;</w:t>
       </w:r>
     </w:p>
     <w:p>
@@ -2478,7 +2478,7 @@
           <w:szCs w:val="24"/>
           <w:rtl w:val="0"/>
         </w:rPr>
-        <w:t xml:space="preserve"> If BUL is involved in a merger, acquisition, financing, restructuring, bankruptcy, or sale of all or part of its business or assets, personal information may be disclosed or transferred as part of that transaction. We will require the recipient to handle personal information in a manner consistent with this Policy (or provide notice and choices where required by law).</w:t>
+        <w:t xml:space="preserve"> If Bettim is involved in a merger, acquisition, financing, restructuring, bankruptcy, or sale of all or part of its business or assets, personal information may be disclosed or transferred as part of that transaction. We will require the recipient to handle personal information in a manner consistent with this Policy (or provide notice and choices where required by law).</w:t>
       </w:r>
     </w:p>
     <w:p>
@@ -2553,7 +2553,7 @@
           <w:szCs w:val="24"/>
           <w:rtl w:val="0"/>
         </w:rPr>
-        <w:t xml:space="preserve">User Content is created and provided by users, not by BUL. BUL does not control, endorse, or guarantee the accuracy, integrity, or appropriateness of any User Content, and is not responsible for User Content posted by users.</w:t>
+        <w:t xml:space="preserve">User Content is created and provided by users, not by Bettim. Bettim does not control, endorse, or guarantee the accuracy, integrity, or appropriateness of any User Content, and is not responsible for User Content posted by users.</w:t>
         <w:br w:type="textWrapping"/>
       </w:r>
       <w:r>
@@ -2574,16 +2574,16 @@
           <w:szCs w:val="24"/>
           <w:rtl w:val="0"/>
         </w:rPr>
-        <w:t xml:space="preserve">BUL has no obligation to monitor, pre-screen, or filter User Content and does not guarantee that any moderation will be timely, complete, or error-free.</w:t>
-      </w:r>
-      <w:r>
-        <w:rPr>
-          <w:color w:val="0f1115"/>
-          <w:sz w:val="24"/>
-          <w:szCs w:val="24"/>
-          <w:rtl w:val="0"/>
-        </w:rPr>
-        <w:t xml:space="preserve"> BUL </w:t>
+        <w:t xml:space="preserve">Bettim has no obligation to monitor, pre-screen, or filter User Content and does not guarantee that any moderation will be timely, complete, or error-free.</w:t>
+      </w:r>
+      <w:r>
+        <w:rPr>
+          <w:color w:val="0f1115"/>
+          <w:sz w:val="24"/>
+          <w:szCs w:val="24"/>
+          <w:rtl w:val="0"/>
+        </w:rPr>
+        <w:t xml:space="preserve"> Bettim </w:t>
       </w:r>
       <w:r>
         <w:rPr>
@@ -2635,7 +2635,7 @@
           <w:szCs w:val="24"/>
           <w:rtl w:val="0"/>
         </w:rPr>
-        <w:t xml:space="preserve"> Where applicable, if you install or access the Services through Apple or Google, those platform providers may collect certain information in accordance with their own terms and policies. If BUL introduces paid features in the future, any purchase processing handled through app stores will be governed by the applicable app store billing and refund policies.</w:t>
+        <w:t xml:space="preserve"> Where applicable, if you install or access the Services through Apple or Google, those platform providers may collect certain information in accordance with their own terms and policies. If Bettim introduces paid features in the future, any purchase processing handled through app stores will be governed by the applicable app store billing and refund policies.</w:t>
       </w:r>
     </w:p>
     <w:p>
@@ -2803,66 +2803,66 @@
           <w:szCs w:val="24"/>
           <w:rtl w:val="0"/>
         </w:rPr>
-        <w:t xml:space="preserve"> BUL relies on the 2021 Standard Contractual Clauses (SCCs) approved by the EU Commission, plus technical safeguards such as encryption and minimization. </w:t>
-      </w:r>
-      <w:r>
-        <w:rPr>
-          <w:b w:val="1"/>
-          <w:bCs w:val="1"/>
-          <w:color w:val="0f1115"/>
-          <w:sz w:val="24"/>
-          <w:szCs w:val="24"/>
-          <w:rtl w:val="0"/>
-        </w:rPr>
-        <w:t xml:space="preserve">For transfers of personal data from the United Kingdom, BUL uses the UK ICO International Data Transfer Agreement (IDTA) or the UK Addendum to the EU Standard Contractual Clauses (SCCs), as applicable under the UK Data Protection Act 2018 and the UK GDPR.</w:t>
-      </w:r>
-    </w:p>
-    <w:p>
-      <w:pPr>
-        <w:shd w:fill="ffffff" w:val="clear"/>
-        <w:spacing w:after="240" w:before="240" w:lineRule="auto"/>
-        <w:rPr>
-          <w:b w:val="1"/>
-          <w:bCs w:val="1"/>
-          <w:color w:val="0f1115"/>
-          <w:sz w:val="24"/>
-          <w:szCs w:val="24"/>
-        </w:rPr>
-      </w:pPr>
-      <w:r>
-        <w:rPr>
-          <w:b w:val="1"/>
-          <w:bCs w:val="1"/>
-          <w:color w:val="0f1115"/>
-          <w:sz w:val="24"/>
-          <w:szCs w:val="24"/>
-          <w:rtl w:val="0"/>
-        </w:rPr>
-        <w:t xml:space="preserve">BUL also conducts Transfer Impact Assessments (TIAs) and applies supplementary measures — including encryption, minimization, and strict access controls — where required by law to ensure equivalent protection for personal data transferred to non-adequate jurisdictions.</w:t>
-      </w:r>
-    </w:p>
-    <w:p>
-      <w:pPr>
-        <w:shd w:fill="ffffff" w:val="clear"/>
-        <w:spacing w:after="240" w:before="240" w:lineRule="auto"/>
-        <w:rPr>
-          <w:b w:val="1"/>
-          <w:bCs w:val="1"/>
-          <w:color w:val="0f1115"/>
-          <w:sz w:val="24"/>
-          <w:szCs w:val="24"/>
-        </w:rPr>
-      </w:pPr>
-      <w:r>
-        <w:rPr>
-          <w:b w:val="1"/>
-          <w:bCs w:val="1"/>
-          <w:color w:val="0f1115"/>
-          <w:sz w:val="24"/>
-          <w:szCs w:val="24"/>
-          <w:rtl w:val="0"/>
-        </w:rPr>
-        <w:t xml:space="preserve">BUL does not transfer personal data to any country lacking adequate data protection unless such transfer is strictly necessary, subject to appropriate safeguards, and compliant with applicable law.</w:t>
+        <w:t xml:space="preserve"> Bettim relies on the 2021 Standard Contractual Clauses (SCCs) approved by the EU Commission, plus technical safeguards such as encryption and minimization. </w:t>
+      </w:r>
+      <w:r>
+        <w:rPr>
+          <w:b w:val="1"/>
+          <w:bCs w:val="1"/>
+          <w:color w:val="0f1115"/>
+          <w:sz w:val="24"/>
+          <w:szCs w:val="24"/>
+          <w:rtl w:val="0"/>
+        </w:rPr>
+        <w:t xml:space="preserve">For transfers of personal data from the United Kingdom, Bettim uses the UK ICO International Data Transfer Agreement (IDTA) or the UK Addendum to the EU Standard Contractual Clauses (SCCs), as applicable under the UK Data Protection Act 2018 and the UK GDPR.</w:t>
+      </w:r>
+    </w:p>
+    <w:p>
+      <w:pPr>
+        <w:shd w:fill="ffffff" w:val="clear"/>
+        <w:spacing w:after="240" w:before="240" w:lineRule="auto"/>
+        <w:rPr>
+          <w:b w:val="1"/>
+          <w:bCs w:val="1"/>
+          <w:color w:val="0f1115"/>
+          <w:sz w:val="24"/>
+          <w:szCs w:val="24"/>
+        </w:rPr>
+      </w:pPr>
+      <w:r>
+        <w:rPr>
+          <w:b w:val="1"/>
+          <w:bCs w:val="1"/>
+          <w:color w:val="0f1115"/>
+          <w:sz w:val="24"/>
+          <w:szCs w:val="24"/>
+          <w:rtl w:val="0"/>
+        </w:rPr>
+        <w:t xml:space="preserve">Bettim also conducts Transfer Impact Assessments (TIAs) and applies supplementary measures — including encryption, minimization, and strict access controls — where required by law to ensure equivalent protection for personal data transferred to non-adequate jurisdictions.</w:t>
+      </w:r>
+    </w:p>
+    <w:p>
+      <w:pPr>
+        <w:shd w:fill="ffffff" w:val="clear"/>
+        <w:spacing w:after="240" w:before="240" w:lineRule="auto"/>
+        <w:rPr>
+          <w:b w:val="1"/>
+          <w:bCs w:val="1"/>
+          <w:color w:val="0f1115"/>
+          <w:sz w:val="24"/>
+          <w:szCs w:val="24"/>
+        </w:rPr>
+      </w:pPr>
+      <w:r>
+        <w:rPr>
+          <w:b w:val="1"/>
+          <w:bCs w:val="1"/>
+          <w:color w:val="0f1115"/>
+          <w:sz w:val="24"/>
+          <w:szCs w:val="24"/>
+          <w:rtl w:val="0"/>
+        </w:rPr>
+        <w:t xml:space="preserve">Bettim does not transfer personal data to any country lacking adequate data protection unless such transfer is strictly necessary, subject to appropriate safeguards, and compliant with applicable law.</w:t>
       </w:r>
     </w:p>
     <w:p>
@@ -3147,7 +3147,7 @@
           <w:szCs w:val="24"/>
           <w:rtl w:val="0"/>
         </w:rPr>
-        <w:t xml:space="preserve">While BUL maintains safeguards, no electronic system is 100% secure. If a breach posing significant risk occurs, we will notify affected users and relevant authorities promptly, in accordance with law.</w:t>
+        <w:t xml:space="preserve">While Bettim maintains safeguards, no electronic system is 100% secure. If a breach posing significant risk occurs, we will notify affected users and relevant authorities promptly, in accordance with law.</w:t>
       </w:r>
     </w:p>
     <w:p>
@@ -3260,7 +3260,7 @@
           <w:szCs w:val="24"/>
           <w:rtl w:val="0"/>
         </w:rPr>
-        <w:t xml:space="preserve">BUL does not use cookies for advertising or behavioral profiling. We only use </w:t>
+        <w:t xml:space="preserve">Bettim does not use cookies for advertising or behavioral profiling. We only use </w:t>
       </w:r>
       <w:r>
         <w:rPr>
@@ -3344,7 +3344,7 @@
           <w:szCs w:val="24"/>
           <w:rtl w:val="0"/>
         </w:rPr>
-        <w:t xml:space="preserve">BUL does not engage in targeted advertising or cross-context behavioral tracking. We also honor applicable opt-out preference signals, such as the Global Privacy Control (GPC), where required by law.</w:t>
+        <w:t xml:space="preserve">Bettim does not engage in targeted advertising or cross-context behavioral tracking. We also honor applicable opt-out preference signals, such as the Global Privacy Control (GPC), where required by law.</w:t>
       </w:r>
     </w:p>
     <w:p>
@@ -3508,7 +3508,7 @@
           <w:szCs w:val="24"/>
           <w:rtl w:val="0"/>
         </w:rPr>
-        <w:t xml:space="preserve">You can exercise these rights by contacting support@bettim.co. We may verify your identity before processing requests and will respond without undue delay and, where applicable, within 30 days (GDPR/UK GDPR) or 45 days (CCPA/CPRA). This period may be extended once by an additional 45 days where reasonably necessary. We will not discriminate against any user for exercising privacy rights. BUL also honors substantially similar privacy rights granted under other U.S. state privacy laws (including Virginia, Colorado, Connecticut, and Utah).</w:t>
+        <w:t xml:space="preserve">You can exercise these rights by contacting support@bettim.co. We may verify your identity before processing requests and will respond without undue delay and, where applicable, within 30 days (GDPR/UK GDPR) or 45 days (CCPA/CPRA). This period may be extended once by an additional 45 days where reasonably necessary. We will not discriminate against any user for exercising privacy rights. Bettim also honors substantially similar privacy rights granted under other U.S. state privacy laws (including Virginia, Colorado, Connecticut, and Utah).</w:t>
       </w:r>
     </w:p>
     <w:p>
@@ -3688,7 +3688,7 @@
           <w:szCs w:val="24"/>
           <w:rtl w:val="0"/>
         </w:rPr>
-        <w:t xml:space="preserve">Please note that BUL does not sell or share personal information as these terms are defined under the CCPA/CPRA.</w:t>
+        <w:t xml:space="preserve">Please note that Bettim does not sell or share personal information as these terms are defined under the CCPA/CPRA.</w:t>
       </w:r>
     </w:p>
     <w:p>
@@ -3847,7 +3847,7 @@
           <w:szCs w:val="24"/>
           <w:rtl w:val="0"/>
         </w:rPr>
-        <w:t xml:space="preserve">You can unsubscribe from marketing emails via opt-out links or app settings. However, BUL will continue to send essential service notifications (e.g., security alerts, account recovery).</w:t>
+        <w:t xml:space="preserve">You can unsubscribe from marketing emails via opt-out links or app settings. However, Bettim will continue to send essential service notifications (e.g., security alerts, account recovery).</w:t>
       </w:r>
     </w:p>
     <w:p>
@@ -3978,7 +3978,7 @@
           <w:szCs w:val="24"/>
           <w:rtl w:val="0"/>
         </w:rPr>
-        <w:t xml:space="preserve"> You are solely responsible for your User Content and for any consequences of posting or sharing it. BUL does not endorse, verify, or guarantee User Content and is not responsible for User Content posted by users, including statements, advice, links, or files shared by users.</w:t>
+        <w:t xml:space="preserve"> You are solely responsible for your User Content and for any consequences of posting or sharing it. Bettim does not endorse, verify, or guarantee User Content and is not responsible for User Content posted by users, including statements, advice, links, or files shared by users.</w:t>
       </w:r>
     </w:p>
     <w:p>
@@ -4009,7 +4009,7 @@
           <w:szCs w:val="24"/>
           <w:rtl w:val="0"/>
         </w:rPr>
-        <w:t xml:space="preserve"> BUL has no obligation to monitor, screen, or filter User Content, and we do not guarantee that any moderation will detect or prevent all prohibited or harmful content. BUL may (but is not required to) remove or restrict User Content or access to community features to enforce our Terms of Service, comply with law, or protect users and platform integrity.</w:t>
+        <w:t xml:space="preserve"> Bettim has no obligation to monitor, screen, or filter User Content, and we do not guarantee that any moderation will detect or prevent all prohibited or harmful content. Bettim may (but is not required to) remove or restrict User Content or access to community features to enforce our Terms of Service, comply with law, or protect users and platform integrity.</w:t>
         <w:br w:type="textWrapping"/>
         <w:t xml:space="preserve">Users may report suspected violations through the in-app reporting tools (where available) or by contacting support@bettim.co.</w:t>
       </w:r>
@@ -4032,7 +4032,7 @@
           <w:szCs w:val="24"/>
           <w:rtl w:val="0"/>
         </w:rPr>
-        <w:t xml:space="preserve">BUL is not responsible for user interactions, disputes, or any harm, loss, or damage resulting from communications or interactions between users, whether online or offline.</w:t>
+        <w:t xml:space="preserve">Bettim is not responsible for user interactions, disputes, or any harm, loss, or damage resulting from communications or interactions between users, whether online or offline.</w:t>
       </w:r>
     </w:p>
     <w:p>
@@ -4465,7 +4465,7 @@
           <w:szCs w:val="24"/>
           <w:rtl w:val="0"/>
         </w:rPr>
-        <w:t xml:space="preserve">BUL has appointed a privacy and compliance contact responsible for overseeing data protection matters.</w:t>
+        <w:t xml:space="preserve">Bettim has appointed a privacy and compliance contact responsible for overseeing data protection matters.</w:t>
         <w:br w:type="textWrapping"/>
         <w:t xml:space="preserve">You may contact this representative at support@bettim.co for any inquiries related to GDPR, UK GDPR, CCPA, or other data protection frameworks.</w:t>
       </w:r>
@@ -4491,7 +4491,7 @@
           <w:szCs w:val="24"/>
           <w:rtl w:val="0"/>
         </w:rPr>
-        <w:t xml:space="preserve">BUL does not maintain a separate privacy inbox; all privacy-related requests are processed via support@bettim.co under strict internal routing protocols.</w:t>
+        <w:t xml:space="preserve">Bettim does not maintain a separate privacy inbox; all privacy-related requests are processed via support@bettim.co under strict internal routing protocols.</w:t>
       </w:r>
     </w:p>
     <w:p>
@@ -4517,7 +4517,7 @@
         </w:rPr>
         <w:t xml:space="preserve">EU/UK Representatives (Art. 27)</w:t>
         <w:br w:type="textWrapping"/>
-        <w:t xml:space="preserve">If BUL is later required to appoint data protection representatives in the European Union or the United Kingdom, their contact details will be published here. Until such appointment, users in those regions may contact us directly at support@bettim.co.</w:t>
+        <w:t xml:space="preserve">If Bettim is later required to appoint data protection representatives in the European Union or the United Kingdom, their contact details will be published here. Until such appointment, users in those regions may contact us directly at support@bettim.co.</w:t>
       </w:r>
     </w:p>
     <w:p>
@@ -4624,7 +4624,7 @@
           <w:szCs w:val="24"/>
           <w:rtl w:val="0"/>
         </w:rPr>
-        <w:t xml:space="preserve">This document represents the complete and authoritative version of the BUL Privacy Policy.</w:t>
+        <w:t xml:space="preserve">This document represents the complete and authoritative version of the Bettim Privacy Policy.</w:t>
       </w:r>
     </w:p>
     <w:p>

</xml_diff>

<commit_message>
Reapply "Merge pull request #6 from alanskverer/scrollcraft/extreme"
This reverts commit a2b9bace6fce8fbf34ab9f0cbf2ab797eb8aae38.
</commit_message>
<xml_diff>
--- a/public/docs/privacy-policy.docx
+++ b/public/docs/privacy-policy.docx
@@ -23,7 +23,7 @@
           <w:szCs w:val="30"/>
           <w:rtl w:val="0"/>
         </w:rPr>
-        <w:t xml:space="preserve">🟣 Bettim Privacy Policy</w:t>
+        <w:t xml:space="preserve">🟣 BUL Privacy Policy</w:t>
       </w:r>
     </w:p>
     <w:p>
@@ -170,7 +170,7 @@
           <w:szCs w:val="24"/>
           <w:rtl w:val="0"/>
         </w:rPr>
-        <w:t xml:space="preserve">This Privacy Policy explains how Bettim Ltd. ("Bettim", "we", "us", or "our") collects, uses, shares, and safeguards your personal information when you access or use the Bettim mobile application, website, and any related features or services (collectively, the "Services").</w:t>
+        <w:t xml:space="preserve">This Privacy Policy explains how Bettim Ltd. ("BUL", "we", "us", or "our") collects, uses, shares, and safeguards your personal information when you access or use the BUL mobile application, website, and any related features or services (collectively, the "Services").</w:t>
       </w:r>
     </w:p>
     <w:p>
@@ -225,27 +225,27 @@
           <w:szCs w:val="24"/>
           <w:rtl w:val="0"/>
         </w:rPr>
-        <w:t xml:space="preserve">Bettim is an independent platform and is not affiliated with, sponsored by, or endorsed by the National Basketball Association (NBA), the NCAA, or any of their respective teams or organizations. Any references within the Services to leagues, teams, players, venues, trademarks, or events are for informational and descriptive purposes only and do not imply any partnership, endorsement, or official status.</w:t>
-      </w:r>
-    </w:p>
-    <w:p>
-      <w:pPr>
-        <w:shd w:fill="ffffff" w:val="clear"/>
-        <w:spacing w:after="240" w:before="240" w:lineRule="auto"/>
-        <w:rPr>
-          <w:color w:val="0f1115"/>
-          <w:sz w:val="24"/>
-          <w:szCs w:val="24"/>
-        </w:rPr>
-      </w:pPr>
-      <w:r>
-        <w:rPr>
-          <w:color w:val="0f1115"/>
-          <w:sz w:val="24"/>
-          <w:szCs w:val="24"/>
-          <w:rtl w:val="0"/>
-        </w:rPr>
-        <w:t xml:space="preserve">By using Bettim, you agree to this Policy and to our Terms of Service. If you do not agree, please discontinue use of the Services.</w:t>
+        <w:t xml:space="preserve">BUL is an independent platform and is not affiliated with, sponsored by, or endorsed by the National Basketball Association (NBA), the NCAA, or any of their respective teams or organizations. Any references within the Services to leagues, teams, players, venues, trademarks, or events are for informational and descriptive purposes only and do not imply any partnership, endorsement, or official status.</w:t>
+      </w:r>
+    </w:p>
+    <w:p>
+      <w:pPr>
+        <w:shd w:fill="ffffff" w:val="clear"/>
+        <w:spacing w:after="240" w:before="240" w:lineRule="auto"/>
+        <w:rPr>
+          <w:color w:val="0f1115"/>
+          <w:sz w:val="24"/>
+          <w:szCs w:val="24"/>
+        </w:rPr>
+      </w:pPr>
+      <w:r>
+        <w:rPr>
+          <w:color w:val="0f1115"/>
+          <w:sz w:val="24"/>
+          <w:szCs w:val="24"/>
+          <w:rtl w:val="0"/>
+        </w:rPr>
+        <w:t xml:space="preserve">By using BUL, you agree to this Policy and to our Terms of Service. If you do not agree, please discontinue use of the Services.</w:t>
       </w:r>
     </w:p>
     <w:p>
@@ -289,7 +289,7 @@
           <w:szCs w:val="24"/>
           <w:rtl w:val="0"/>
         </w:rPr>
-        <w:t xml:space="preserve">Bettim provides an entertaining, social, skill-based sports experience powered by virtual coins only — no real-money gambling, deposits, or withdrawals.</w:t>
+        <w:t xml:space="preserve">BUL provides an entertaining, social, skill-based sports experience powered by virtual coins only — no real-money gambling, deposits, or withdrawals.</w:t>
       </w:r>
     </w:p>
     <w:p>
@@ -478,7 +478,7 @@
           <w:szCs w:val="24"/>
           <w:rtl w:val="0"/>
         </w:rPr>
-        <w:t xml:space="preserve">In rare cases, Bettim may request verification to confirm eligibility, prevent fraud, or comply with laws. You may redact irrelevant details (e.g., ID number). Verification data is stored only as long as needed to complete the review, then permanently deleted.</w:t>
+        <w:t xml:space="preserve">In rare cases, BUL may request verification to confirm eligibility, prevent fraud, or comply with laws. You may redact irrelevant details (e.g., ID number). Verification data is stored only as long as needed to complete the review, then permanently deleted.</w:t>
       </w:r>
     </w:p>
     <w:p>
@@ -522,7 +522,7 @@
           <w:szCs w:val="24"/>
           <w:rtl w:val="0"/>
         </w:rPr>
-        <w:t xml:space="preserve">When you use Bettim, we automatically collect:</w:t>
+        <w:t xml:space="preserve">When you use BUL, we automatically collect:</w:t>
       </w:r>
     </w:p>
     <w:p>
@@ -1863,7 +1863,7 @@
           <w:szCs w:val="24"/>
           <w:rtl w:val="0"/>
         </w:rPr>
-        <w:t xml:space="preserve">In addition, Bettim does not make decisions based solely on automated processing that produce legal or similarly significant effects on users. Any automated checks (e.g., where available VPN/proxy indicators or device integrity signals) are limited to protecting the Services, maintaining fairness, and enforcing our Terms of Service.</w:t>
+        <w:t xml:space="preserve">In addition, BUL does not make decisions based solely on automated processing that produce legal or similarly significant effects on users. Any automated checks (e.g., where available VPN/proxy indicators or device integrity signals) are limited to protecting the Services, maintaining fairness, and enforcing our Terms of Service.</w:t>
       </w:r>
     </w:p>
     <w:p>
@@ -1944,7 +1944,7 @@
           <w:szCs w:val="24"/>
           <w:rtl w:val="0"/>
         </w:rPr>
-        <w:t xml:space="preserve">Depending on your jurisdiction, Bettim processes your data under:</w:t>
+        <w:t xml:space="preserve">Depending on your jurisdiction, BUL processes your data under:</w:t>
       </w:r>
     </w:p>
     <w:p>
@@ -2154,9 +2154,9 @@
         </w:rPr>
         <w:t xml:space="preserve">Global Privacy Compliance</w:t>
         <w:br w:type="textWrapping"/>
-        <w:t xml:space="preserve">Bettim processes personal data in accordance with applicable privacy and data protection laws in the regions where our users are located, including (where relevant) the EU GDPR, UK GDPR, the California Consumer Privacy Act (CCPA/CPRA), Brazil's General Data Protection Law (LGPD), and Canada's Personal Information Protection and Electronic Documents Act (PIPEDA).</w:t>
-        <w:br w:type="textWrapping"/>
-        <w:t xml:space="preserve">Nothing in this Policy shall be interpreted as Bettim submitting to the jurisdiction of any foreign authority or waiving its exclusive jurisdiction in Israel as defined in our Terms of Service.</w:t>
+        <w:t xml:space="preserve">BUL processes personal data in accordance with applicable privacy and data protection laws in the regions where our users are located, including (where relevant) the EU GDPR, UK GDPR, the California Consumer Privacy Act (CCPA/CPRA), Brazil's General Data Protection Law (LGPD), and Canada's Personal Information Protection and Electronic Documents Act (PIPEDA).</w:t>
+        <w:br w:type="textWrapping"/>
+        <w:t xml:space="preserve">Nothing in this Policy shall be interpreted as BUL submitting to the jurisdiction of any foreign authority or waiving its exclusive jurisdiction in Israel as defined in our Terms of Service.</w:t>
       </w:r>
     </w:p>
     <w:p>
@@ -2225,7 +2225,7 @@
           <w:szCs w:val="24"/>
           <w:rtl w:val="0"/>
         </w:rPr>
-        <w:t xml:space="preserve">We may share personal information only as described below and only to the extent necessary to operate the Services, comply with law, and protect Bettim and users.</w:t>
+        <w:t xml:space="preserve">We may share personal information only as described below and only to the extent necessary to operate the Services, comply with law, and protect BUL and users.</w:t>
       </w:r>
     </w:p>
     <w:p>
@@ -2289,7 +2289,7 @@
           <w:szCs w:val="24"/>
           <w:rtl w:val="0"/>
         </w:rPr>
-        <w:t xml:space="preserve"> We may share information with our affiliates, subsidiaries, and related entities for internal business purposes consistent with this Policy, including operating, improving, securing, and supporting the Services. References to “Bettim” include such entities where applicable.</w:t>
+        <w:t xml:space="preserve"> We may share information with our affiliates, subsidiaries, and related entities for internal business purposes consistent with this Policy, including operating, improving, securing, and supporting the Services. References to “BUL” include such entities where applicable.</w:t>
       </w:r>
     </w:p>
     <w:p>
@@ -2396,7 +2396,7 @@
           <w:szCs w:val="24"/>
           <w:rtl w:val="0"/>
         </w:rPr>
-        <w:t xml:space="preserve">Protect the rights, property, and safety of Bettim, our users, or others;</w:t>
+        <w:t xml:space="preserve">Protect the rights, property, and safety of BUL, our users, or others;</w:t>
       </w:r>
     </w:p>
     <w:p>
@@ -2478,7 +2478,7 @@
           <w:szCs w:val="24"/>
           <w:rtl w:val="0"/>
         </w:rPr>
-        <w:t xml:space="preserve"> If Bettim is involved in a merger, acquisition, financing, restructuring, bankruptcy, or sale of all or part of its business or assets, personal information may be disclosed or transferred as part of that transaction. We will require the recipient to handle personal information in a manner consistent with this Policy (or provide notice and choices where required by law).</w:t>
+        <w:t xml:space="preserve"> If BUL is involved in a merger, acquisition, financing, restructuring, bankruptcy, or sale of all or part of its business or assets, personal information may be disclosed or transferred as part of that transaction. We will require the recipient to handle personal information in a manner consistent with this Policy (or provide notice and choices where required by law).</w:t>
       </w:r>
     </w:p>
     <w:p>
@@ -2553,7 +2553,7 @@
           <w:szCs w:val="24"/>
           <w:rtl w:val="0"/>
         </w:rPr>
-        <w:t xml:space="preserve">User Content is created and provided by users, not by Bettim. Bettim does not control, endorse, or guarantee the accuracy, integrity, or appropriateness of any User Content, and is not responsible for User Content posted by users.</w:t>
+        <w:t xml:space="preserve">User Content is created and provided by users, not by BUL. BUL does not control, endorse, or guarantee the accuracy, integrity, or appropriateness of any User Content, and is not responsible for User Content posted by users.</w:t>
         <w:br w:type="textWrapping"/>
       </w:r>
       <w:r>
@@ -2574,16 +2574,16 @@
           <w:szCs w:val="24"/>
           <w:rtl w:val="0"/>
         </w:rPr>
-        <w:t xml:space="preserve">Bettim has no obligation to monitor, pre-screen, or filter User Content and does not guarantee that any moderation will be timely, complete, or error-free.</w:t>
-      </w:r>
-      <w:r>
-        <w:rPr>
-          <w:color w:val="0f1115"/>
-          <w:sz w:val="24"/>
-          <w:szCs w:val="24"/>
-          <w:rtl w:val="0"/>
-        </w:rPr>
-        <w:t xml:space="preserve"> Bettim </w:t>
+        <w:t xml:space="preserve">BUL has no obligation to monitor, pre-screen, or filter User Content and does not guarantee that any moderation will be timely, complete, or error-free.</w:t>
+      </w:r>
+      <w:r>
+        <w:rPr>
+          <w:color w:val="0f1115"/>
+          <w:sz w:val="24"/>
+          <w:szCs w:val="24"/>
+          <w:rtl w:val="0"/>
+        </w:rPr>
+        <w:t xml:space="preserve"> BUL </w:t>
       </w:r>
       <w:r>
         <w:rPr>
@@ -2635,7 +2635,7 @@
           <w:szCs w:val="24"/>
           <w:rtl w:val="0"/>
         </w:rPr>
-        <w:t xml:space="preserve"> Where applicable, if you install or access the Services through Apple or Google, those platform providers may collect certain information in accordance with their own terms and policies. If Bettim introduces paid features in the future, any purchase processing handled through app stores will be governed by the applicable app store billing and refund policies.</w:t>
+        <w:t xml:space="preserve"> Where applicable, if you install or access the Services through Apple or Google, those platform providers may collect certain information in accordance with their own terms and policies. If BUL introduces paid features in the future, any purchase processing handled through app stores will be governed by the applicable app store billing and refund policies.</w:t>
       </w:r>
     </w:p>
     <w:p>
@@ -2803,66 +2803,66 @@
           <w:szCs w:val="24"/>
           <w:rtl w:val="0"/>
         </w:rPr>
-        <w:t xml:space="preserve"> Bettim relies on the 2021 Standard Contractual Clauses (SCCs) approved by the EU Commission, plus technical safeguards such as encryption and minimization. </w:t>
-      </w:r>
-      <w:r>
-        <w:rPr>
-          <w:b w:val="1"/>
-          <w:bCs w:val="1"/>
-          <w:color w:val="0f1115"/>
-          <w:sz w:val="24"/>
-          <w:szCs w:val="24"/>
-          <w:rtl w:val="0"/>
-        </w:rPr>
-        <w:t xml:space="preserve">For transfers of personal data from the United Kingdom, Bettim uses the UK ICO International Data Transfer Agreement (IDTA) or the UK Addendum to the EU Standard Contractual Clauses (SCCs), as applicable under the UK Data Protection Act 2018 and the UK GDPR.</w:t>
-      </w:r>
-    </w:p>
-    <w:p>
-      <w:pPr>
-        <w:shd w:fill="ffffff" w:val="clear"/>
-        <w:spacing w:after="240" w:before="240" w:lineRule="auto"/>
-        <w:rPr>
-          <w:b w:val="1"/>
-          <w:bCs w:val="1"/>
-          <w:color w:val="0f1115"/>
-          <w:sz w:val="24"/>
-          <w:szCs w:val="24"/>
-        </w:rPr>
-      </w:pPr>
-      <w:r>
-        <w:rPr>
-          <w:b w:val="1"/>
-          <w:bCs w:val="1"/>
-          <w:color w:val="0f1115"/>
-          <w:sz w:val="24"/>
-          <w:szCs w:val="24"/>
-          <w:rtl w:val="0"/>
-        </w:rPr>
-        <w:t xml:space="preserve">Bettim also conducts Transfer Impact Assessments (TIAs) and applies supplementary measures — including encryption, minimization, and strict access controls — where required by law to ensure equivalent protection for personal data transferred to non-adequate jurisdictions.</w:t>
-      </w:r>
-    </w:p>
-    <w:p>
-      <w:pPr>
-        <w:shd w:fill="ffffff" w:val="clear"/>
-        <w:spacing w:after="240" w:before="240" w:lineRule="auto"/>
-        <w:rPr>
-          <w:b w:val="1"/>
-          <w:bCs w:val="1"/>
-          <w:color w:val="0f1115"/>
-          <w:sz w:val="24"/>
-          <w:szCs w:val="24"/>
-        </w:rPr>
-      </w:pPr>
-      <w:r>
-        <w:rPr>
-          <w:b w:val="1"/>
-          <w:bCs w:val="1"/>
-          <w:color w:val="0f1115"/>
-          <w:sz w:val="24"/>
-          <w:szCs w:val="24"/>
-          <w:rtl w:val="0"/>
-        </w:rPr>
-        <w:t xml:space="preserve">Bettim does not transfer personal data to any country lacking adequate data protection unless such transfer is strictly necessary, subject to appropriate safeguards, and compliant with applicable law.</w:t>
+        <w:t xml:space="preserve"> BUL relies on the 2021 Standard Contractual Clauses (SCCs) approved by the EU Commission, plus technical safeguards such as encryption and minimization. </w:t>
+      </w:r>
+      <w:r>
+        <w:rPr>
+          <w:b w:val="1"/>
+          <w:bCs w:val="1"/>
+          <w:color w:val="0f1115"/>
+          <w:sz w:val="24"/>
+          <w:szCs w:val="24"/>
+          <w:rtl w:val="0"/>
+        </w:rPr>
+        <w:t xml:space="preserve">For transfers of personal data from the United Kingdom, BUL uses the UK ICO International Data Transfer Agreement (IDTA) or the UK Addendum to the EU Standard Contractual Clauses (SCCs), as applicable under the UK Data Protection Act 2018 and the UK GDPR.</w:t>
+      </w:r>
+    </w:p>
+    <w:p>
+      <w:pPr>
+        <w:shd w:fill="ffffff" w:val="clear"/>
+        <w:spacing w:after="240" w:before="240" w:lineRule="auto"/>
+        <w:rPr>
+          <w:b w:val="1"/>
+          <w:bCs w:val="1"/>
+          <w:color w:val="0f1115"/>
+          <w:sz w:val="24"/>
+          <w:szCs w:val="24"/>
+        </w:rPr>
+      </w:pPr>
+      <w:r>
+        <w:rPr>
+          <w:b w:val="1"/>
+          <w:bCs w:val="1"/>
+          <w:color w:val="0f1115"/>
+          <w:sz w:val="24"/>
+          <w:szCs w:val="24"/>
+          <w:rtl w:val="0"/>
+        </w:rPr>
+        <w:t xml:space="preserve">BUL also conducts Transfer Impact Assessments (TIAs) and applies supplementary measures — including encryption, minimization, and strict access controls — where required by law to ensure equivalent protection for personal data transferred to non-adequate jurisdictions.</w:t>
+      </w:r>
+    </w:p>
+    <w:p>
+      <w:pPr>
+        <w:shd w:fill="ffffff" w:val="clear"/>
+        <w:spacing w:after="240" w:before="240" w:lineRule="auto"/>
+        <w:rPr>
+          <w:b w:val="1"/>
+          <w:bCs w:val="1"/>
+          <w:color w:val="0f1115"/>
+          <w:sz w:val="24"/>
+          <w:szCs w:val="24"/>
+        </w:rPr>
+      </w:pPr>
+      <w:r>
+        <w:rPr>
+          <w:b w:val="1"/>
+          <w:bCs w:val="1"/>
+          <w:color w:val="0f1115"/>
+          <w:sz w:val="24"/>
+          <w:szCs w:val="24"/>
+          <w:rtl w:val="0"/>
+        </w:rPr>
+        <w:t xml:space="preserve">BUL does not transfer personal data to any country lacking adequate data protection unless such transfer is strictly necessary, subject to appropriate safeguards, and compliant with applicable law.</w:t>
       </w:r>
     </w:p>
     <w:p>
@@ -3147,7 +3147,7 @@
           <w:szCs w:val="24"/>
           <w:rtl w:val="0"/>
         </w:rPr>
-        <w:t xml:space="preserve">While Bettim maintains safeguards, no electronic system is 100% secure. If a breach posing significant risk occurs, we will notify affected users and relevant authorities promptly, in accordance with law.</w:t>
+        <w:t xml:space="preserve">While BUL maintains safeguards, no electronic system is 100% secure. If a breach posing significant risk occurs, we will notify affected users and relevant authorities promptly, in accordance with law.</w:t>
       </w:r>
     </w:p>
     <w:p>
@@ -3260,7 +3260,7 @@
           <w:szCs w:val="24"/>
           <w:rtl w:val="0"/>
         </w:rPr>
-        <w:t xml:space="preserve">Bettim does not use cookies for advertising or behavioral profiling. We only use </w:t>
+        <w:t xml:space="preserve">BUL does not use cookies for advertising or behavioral profiling. We only use </w:t>
       </w:r>
       <w:r>
         <w:rPr>
@@ -3344,7 +3344,7 @@
           <w:szCs w:val="24"/>
           <w:rtl w:val="0"/>
         </w:rPr>
-        <w:t xml:space="preserve">Bettim does not engage in targeted advertising or cross-context behavioral tracking. We also honor applicable opt-out preference signals, such as the Global Privacy Control (GPC), where required by law.</w:t>
+        <w:t xml:space="preserve">BUL does not engage in targeted advertising or cross-context behavioral tracking. We also honor applicable opt-out preference signals, such as the Global Privacy Control (GPC), where required by law.</w:t>
       </w:r>
     </w:p>
     <w:p>
@@ -3508,7 +3508,7 @@
           <w:szCs w:val="24"/>
           <w:rtl w:val="0"/>
         </w:rPr>
-        <w:t xml:space="preserve">You can exercise these rights by contacting support@bettim.co. We may verify your identity before processing requests and will respond without undue delay and, where applicable, within 30 days (GDPR/UK GDPR) or 45 days (CCPA/CPRA). This period may be extended once by an additional 45 days where reasonably necessary. We will not discriminate against any user for exercising privacy rights. Bettim also honors substantially similar privacy rights granted under other U.S. state privacy laws (including Virginia, Colorado, Connecticut, and Utah).</w:t>
+        <w:t xml:space="preserve">You can exercise these rights by contacting support@bettim.co. We may verify your identity before processing requests and will respond without undue delay and, where applicable, within 30 days (GDPR/UK GDPR) or 45 days (CCPA/CPRA). This period may be extended once by an additional 45 days where reasonably necessary. We will not discriminate against any user for exercising privacy rights. BUL also honors substantially similar privacy rights granted under other U.S. state privacy laws (including Virginia, Colorado, Connecticut, and Utah).</w:t>
       </w:r>
     </w:p>
     <w:p>
@@ -3688,7 +3688,7 @@
           <w:szCs w:val="24"/>
           <w:rtl w:val="0"/>
         </w:rPr>
-        <w:t xml:space="preserve">Please note that Bettim does not sell or share personal information as these terms are defined under the CCPA/CPRA.</w:t>
+        <w:t xml:space="preserve">Please note that BUL does not sell or share personal information as these terms are defined under the CCPA/CPRA.</w:t>
       </w:r>
     </w:p>
     <w:p>
@@ -3847,7 +3847,7 @@
           <w:szCs w:val="24"/>
           <w:rtl w:val="0"/>
         </w:rPr>
-        <w:t xml:space="preserve">You can unsubscribe from marketing emails via opt-out links or app settings. However, Bettim will continue to send essential service notifications (e.g., security alerts, account recovery).</w:t>
+        <w:t xml:space="preserve">You can unsubscribe from marketing emails via opt-out links or app settings. However, BUL will continue to send essential service notifications (e.g., security alerts, account recovery).</w:t>
       </w:r>
     </w:p>
     <w:p>
@@ -3978,7 +3978,7 @@
           <w:szCs w:val="24"/>
           <w:rtl w:val="0"/>
         </w:rPr>
-        <w:t xml:space="preserve"> You are solely responsible for your User Content and for any consequences of posting or sharing it. Bettim does not endorse, verify, or guarantee User Content and is not responsible for User Content posted by users, including statements, advice, links, or files shared by users.</w:t>
+        <w:t xml:space="preserve"> You are solely responsible for your User Content and for any consequences of posting or sharing it. BUL does not endorse, verify, or guarantee User Content and is not responsible for User Content posted by users, including statements, advice, links, or files shared by users.</w:t>
       </w:r>
     </w:p>
     <w:p>
@@ -4009,7 +4009,7 @@
           <w:szCs w:val="24"/>
           <w:rtl w:val="0"/>
         </w:rPr>
-        <w:t xml:space="preserve"> Bettim has no obligation to monitor, screen, or filter User Content, and we do not guarantee that any moderation will detect or prevent all prohibited or harmful content. Bettim may (but is not required to) remove or restrict User Content or access to community features to enforce our Terms of Service, comply with law, or protect users and platform integrity.</w:t>
+        <w:t xml:space="preserve"> BUL has no obligation to monitor, screen, or filter User Content, and we do not guarantee that any moderation will detect or prevent all prohibited or harmful content. BUL may (but is not required to) remove or restrict User Content or access to community features to enforce our Terms of Service, comply with law, or protect users and platform integrity.</w:t>
         <w:br w:type="textWrapping"/>
         <w:t xml:space="preserve">Users may report suspected violations through the in-app reporting tools (where available) or by contacting support@bettim.co.</w:t>
       </w:r>
@@ -4032,7 +4032,7 @@
           <w:szCs w:val="24"/>
           <w:rtl w:val="0"/>
         </w:rPr>
-        <w:t xml:space="preserve">Bettim is not responsible for user interactions, disputes, or any harm, loss, or damage resulting from communications or interactions between users, whether online or offline.</w:t>
+        <w:t xml:space="preserve">BUL is not responsible for user interactions, disputes, or any harm, loss, or damage resulting from communications or interactions between users, whether online or offline.</w:t>
       </w:r>
     </w:p>
     <w:p>
@@ -4465,7 +4465,7 @@
           <w:szCs w:val="24"/>
           <w:rtl w:val="0"/>
         </w:rPr>
-        <w:t xml:space="preserve">Bettim has appointed a privacy and compliance contact responsible for overseeing data protection matters.</w:t>
+        <w:t xml:space="preserve">BUL has appointed a privacy and compliance contact responsible for overseeing data protection matters.</w:t>
         <w:br w:type="textWrapping"/>
         <w:t xml:space="preserve">You may contact this representative at support@bettim.co for any inquiries related to GDPR, UK GDPR, CCPA, or other data protection frameworks.</w:t>
       </w:r>
@@ -4491,7 +4491,7 @@
           <w:szCs w:val="24"/>
           <w:rtl w:val="0"/>
         </w:rPr>
-        <w:t xml:space="preserve">Bettim does not maintain a separate privacy inbox; all privacy-related requests are processed via support@bettim.co under strict internal routing protocols.</w:t>
+        <w:t xml:space="preserve">BUL does not maintain a separate privacy inbox; all privacy-related requests are processed via support@bettim.co under strict internal routing protocols.</w:t>
       </w:r>
     </w:p>
     <w:p>
@@ -4517,7 +4517,7 @@
         </w:rPr>
         <w:t xml:space="preserve">EU/UK Representatives (Art. 27)</w:t>
         <w:br w:type="textWrapping"/>
-        <w:t xml:space="preserve">If Bettim is later required to appoint data protection representatives in the European Union or the United Kingdom, their contact details will be published here. Until such appointment, users in those regions may contact us directly at support@bettim.co.</w:t>
+        <w:t xml:space="preserve">If BUL is later required to appoint data protection representatives in the European Union or the United Kingdom, their contact details will be published here. Until such appointment, users in those regions may contact us directly at support@bettim.co.</w:t>
       </w:r>
     </w:p>
     <w:p>
@@ -4624,7 +4624,7 @@
           <w:szCs w:val="24"/>
           <w:rtl w:val="0"/>
         </w:rPr>
-        <w:t xml:space="preserve">This document represents the complete and authoritative version of the Bettim Privacy Policy.</w:t>
+        <w:t xml:space="preserve">This document represents the complete and authoritative version of the BUL Privacy Policy.</w:t>
       </w:r>
     </w:p>
     <w:p>

</xml_diff>